<commit_message>
Add IEEE-format paper generator and point links at the GitHub repo
- reports/generate_paper.py builds reports/IEEE_Paper.docx from pipeline
  artifacts using a style-only IEEE A4 template (tools/make_ieee_template.py)
- Fix lag-correlation figure to use the same transitions as the analysis
- README and config now reference AadityaBhure/HealthCare-Readmission-Analytics
</commit_message>
<xml_diff>
--- a/reports/Project_Report.docx
+++ b/reports/Project_Report.docx
@@ -130,7 +130,7 @@
         <w:t xml:space="preserve">Source code: </w:t>
       </w:r>
       <w:r>
-        <w:t>https://github.com/&lt;your-github-username&gt;/healthcare-readmission-analytics</w:t>
+        <w:t>https://github.com/AadityaBhure/HealthCare-Readmission-Analytics</w:t>
       </w:r>
     </w:p>
     <w:p>
@@ -172,7 +172,7 @@
       <w:r>
         <w:fldChar w:fldCharType="separate"/>
       </w:r>
-      <w:hyperlink w:anchor="_Toc242788763" w:history="1">
+      <w:hyperlink w:anchor="_Toc243759814" w:history="1">
         <w:r>
           <w:rPr>
             <w:rStyle w:val="Hyperlink"/>
@@ -199,7 +199,7 @@
             <w:noProof/>
             <w:webHidden/>
           </w:rPr>
-          <w:instrText xml:space="preserve"> PAGEREF _Toc242788763 \h </w:instrText>
+          <w:instrText xml:space="preserve"> PAGEREF _Toc243759814 \h </w:instrText>
         </w:r>
         <w:r>
           <w:rPr>
@@ -245,7 +245,7 @@
           <w14:ligatures w14:val="standardContextual"/>
         </w:rPr>
       </w:pPr>
-      <w:hyperlink w:anchor="_Toc242788764" w:history="1">
+      <w:hyperlink w:anchor="_Toc243759815" w:history="1">
         <w:r>
           <w:rPr>
             <w:rStyle w:val="Hyperlink"/>
@@ -272,7 +272,7 @@
             <w:noProof/>
             <w:webHidden/>
           </w:rPr>
-          <w:instrText xml:space="preserve"> PAGEREF _Toc242788764 \h </w:instrText>
+          <w:instrText xml:space="preserve"> PAGEREF _Toc243759815 \h </w:instrText>
         </w:r>
         <w:r>
           <w:rPr>
@@ -318,7 +318,7 @@
           <w14:ligatures w14:val="standardContextual"/>
         </w:rPr>
       </w:pPr>
-      <w:hyperlink w:anchor="_Toc242788765" w:history="1">
+      <w:hyperlink w:anchor="_Toc243759816" w:history="1">
         <w:r>
           <w:rPr>
             <w:rStyle w:val="Hyperlink"/>
@@ -345,7 +345,7 @@
             <w:noProof/>
             <w:webHidden/>
           </w:rPr>
-          <w:instrText xml:space="preserve"> PAGEREF _Toc242788765 \h </w:instrText>
+          <w:instrText xml:space="preserve"> PAGEREF _Toc243759816 \h </w:instrText>
         </w:r>
         <w:r>
           <w:rPr>
@@ -391,7 +391,7 @@
           <w14:ligatures w14:val="standardContextual"/>
         </w:rPr>
       </w:pPr>
-      <w:hyperlink w:anchor="_Toc242788766" w:history="1">
+      <w:hyperlink w:anchor="_Toc243759817" w:history="1">
         <w:r>
           <w:rPr>
             <w:rStyle w:val="Hyperlink"/>
@@ -418,7 +418,7 @@
             <w:noProof/>
             <w:webHidden/>
           </w:rPr>
-          <w:instrText xml:space="preserve"> PAGEREF _Toc242788766 \h </w:instrText>
+          <w:instrText xml:space="preserve"> PAGEREF _Toc243759817 \h </w:instrText>
         </w:r>
         <w:r>
           <w:rPr>
@@ -464,7 +464,7 @@
           <w14:ligatures w14:val="standardContextual"/>
         </w:rPr>
       </w:pPr>
-      <w:hyperlink w:anchor="_Toc242788767" w:history="1">
+      <w:hyperlink w:anchor="_Toc243759818" w:history="1">
         <w:r>
           <w:rPr>
             <w:rStyle w:val="Hyperlink"/>
@@ -491,7 +491,7 @@
             <w:noProof/>
             <w:webHidden/>
           </w:rPr>
-          <w:instrText xml:space="preserve"> PAGEREF _Toc242788767 \h </w:instrText>
+          <w:instrText xml:space="preserve"> PAGEREF _Toc243759818 \h </w:instrText>
         </w:r>
         <w:r>
           <w:rPr>
@@ -537,7 +537,7 @@
           <w14:ligatures w14:val="standardContextual"/>
         </w:rPr>
       </w:pPr>
-      <w:hyperlink w:anchor="_Toc242788768" w:history="1">
+      <w:hyperlink w:anchor="_Toc243759819" w:history="1">
         <w:r>
           <w:rPr>
             <w:rStyle w:val="Hyperlink"/>
@@ -564,7 +564,7 @@
             <w:noProof/>
             <w:webHidden/>
           </w:rPr>
-          <w:instrText xml:space="preserve"> PAGEREF _Toc242788768 \h </w:instrText>
+          <w:instrText xml:space="preserve"> PAGEREF _Toc243759819 \h </w:instrText>
         </w:r>
         <w:r>
           <w:rPr>
@@ -610,7 +610,7 @@
           <w14:ligatures w14:val="standardContextual"/>
         </w:rPr>
       </w:pPr>
-      <w:hyperlink w:anchor="_Toc242788769" w:history="1">
+      <w:hyperlink w:anchor="_Toc243759820" w:history="1">
         <w:r>
           <w:rPr>
             <w:rStyle w:val="Hyperlink"/>
@@ -637,7 +637,7 @@
             <w:noProof/>
             <w:webHidden/>
           </w:rPr>
-          <w:instrText xml:space="preserve"> PAGEREF _Toc242788769 \h </w:instrText>
+          <w:instrText xml:space="preserve"> PAGEREF _Toc243759820 \h </w:instrText>
         </w:r>
         <w:r>
           <w:rPr>
@@ -683,7 +683,7 @@
           <w14:ligatures w14:val="standardContextual"/>
         </w:rPr>
       </w:pPr>
-      <w:hyperlink w:anchor="_Toc242788770" w:history="1">
+      <w:hyperlink w:anchor="_Toc243759821" w:history="1">
         <w:r>
           <w:rPr>
             <w:rStyle w:val="Hyperlink"/>
@@ -710,7 +710,7 @@
             <w:noProof/>
             <w:webHidden/>
           </w:rPr>
-          <w:instrText xml:space="preserve"> PAGEREF _Toc242788770 \h </w:instrText>
+          <w:instrText xml:space="preserve"> PAGEREF _Toc243759821 \h </w:instrText>
         </w:r>
         <w:r>
           <w:rPr>
@@ -756,7 +756,7 @@
           <w14:ligatures w14:val="standardContextual"/>
         </w:rPr>
       </w:pPr>
-      <w:hyperlink w:anchor="_Toc242788771" w:history="1">
+      <w:hyperlink w:anchor="_Toc243759822" w:history="1">
         <w:r>
           <w:rPr>
             <w:rStyle w:val="Hyperlink"/>
@@ -783,7 +783,7 @@
             <w:noProof/>
             <w:webHidden/>
           </w:rPr>
-          <w:instrText xml:space="preserve"> PAGEREF _Toc242788771 \h </w:instrText>
+          <w:instrText xml:space="preserve"> PAGEREF _Toc243759822 \h </w:instrText>
         </w:r>
         <w:r>
           <w:rPr>
@@ -829,7 +829,7 @@
           <w14:ligatures w14:val="standardContextual"/>
         </w:rPr>
       </w:pPr>
-      <w:hyperlink w:anchor="_Toc242788772" w:history="1">
+      <w:hyperlink w:anchor="_Toc243759823" w:history="1">
         <w:r>
           <w:rPr>
             <w:rStyle w:val="Hyperlink"/>
@@ -856,7 +856,7 @@
             <w:noProof/>
             <w:webHidden/>
           </w:rPr>
-          <w:instrText xml:space="preserve"> PAGEREF _Toc242788772 \h </w:instrText>
+          <w:instrText xml:space="preserve"> PAGEREF _Toc243759823 \h </w:instrText>
         </w:r>
         <w:r>
           <w:rPr>
@@ -902,7 +902,7 @@
           <w14:ligatures w14:val="standardContextual"/>
         </w:rPr>
       </w:pPr>
-      <w:hyperlink w:anchor="_Toc242788773" w:history="1">
+      <w:hyperlink w:anchor="_Toc243759824" w:history="1">
         <w:r>
           <w:rPr>
             <w:rStyle w:val="Hyperlink"/>
@@ -929,7 +929,7 @@
             <w:noProof/>
             <w:webHidden/>
           </w:rPr>
-          <w:instrText xml:space="preserve"> PAGEREF _Toc242788773 \h </w:instrText>
+          <w:instrText xml:space="preserve"> PAGEREF _Toc243759824 \h </w:instrText>
         </w:r>
         <w:r>
           <w:rPr>
@@ -975,7 +975,7 @@
           <w14:ligatures w14:val="standardContextual"/>
         </w:rPr>
       </w:pPr>
-      <w:hyperlink w:anchor="_Toc242788774" w:history="1">
+      <w:hyperlink w:anchor="_Toc243759825" w:history="1">
         <w:r>
           <w:rPr>
             <w:rStyle w:val="Hyperlink"/>
@@ -1002,7 +1002,7 @@
             <w:noProof/>
             <w:webHidden/>
           </w:rPr>
-          <w:instrText xml:space="preserve"> PAGEREF _Toc242788774 \h </w:instrText>
+          <w:instrText xml:space="preserve"> PAGEREF _Toc243759825 \h </w:instrText>
         </w:r>
         <w:r>
           <w:rPr>
@@ -1048,7 +1048,7 @@
           <w14:ligatures w14:val="standardContextual"/>
         </w:rPr>
       </w:pPr>
-      <w:hyperlink w:anchor="_Toc242788775" w:history="1">
+      <w:hyperlink w:anchor="_Toc243759826" w:history="1">
         <w:r>
           <w:rPr>
             <w:rStyle w:val="Hyperlink"/>
@@ -1075,7 +1075,7 @@
             <w:noProof/>
             <w:webHidden/>
           </w:rPr>
-          <w:instrText xml:space="preserve"> PAGEREF _Toc242788775 \h </w:instrText>
+          <w:instrText xml:space="preserve"> PAGEREF _Toc243759826 \h </w:instrText>
         </w:r>
         <w:r>
           <w:rPr>
@@ -1121,7 +1121,7 @@
           <w14:ligatures w14:val="standardContextual"/>
         </w:rPr>
       </w:pPr>
-      <w:hyperlink w:anchor="_Toc242788776" w:history="1">
+      <w:hyperlink w:anchor="_Toc243759827" w:history="1">
         <w:r>
           <w:rPr>
             <w:rStyle w:val="Hyperlink"/>
@@ -1148,7 +1148,7 @@
             <w:noProof/>
             <w:webHidden/>
           </w:rPr>
-          <w:instrText xml:space="preserve"> PAGEREF _Toc242788776 \h </w:instrText>
+          <w:instrText xml:space="preserve"> PAGEREF _Toc243759827 \h </w:instrText>
         </w:r>
         <w:r>
           <w:rPr>
@@ -1194,7 +1194,7 @@
           <w14:ligatures w14:val="standardContextual"/>
         </w:rPr>
       </w:pPr>
-      <w:hyperlink w:anchor="_Toc242788777" w:history="1">
+      <w:hyperlink w:anchor="_Toc243759828" w:history="1">
         <w:r>
           <w:rPr>
             <w:rStyle w:val="Hyperlink"/>
@@ -1221,7 +1221,7 @@
             <w:noProof/>
             <w:webHidden/>
           </w:rPr>
-          <w:instrText xml:space="preserve"> PAGEREF _Toc242788777 \h </w:instrText>
+          <w:instrText xml:space="preserve"> PAGEREF _Toc243759828 \h </w:instrText>
         </w:r>
         <w:r>
           <w:rPr>
@@ -1267,7 +1267,7 @@
           <w14:ligatures w14:val="standardContextual"/>
         </w:rPr>
       </w:pPr>
-      <w:hyperlink w:anchor="_Toc242788778" w:history="1">
+      <w:hyperlink w:anchor="_Toc243759829" w:history="1">
         <w:r>
           <w:rPr>
             <w:rStyle w:val="Hyperlink"/>
@@ -1294,7 +1294,7 @@
             <w:noProof/>
             <w:webHidden/>
           </w:rPr>
-          <w:instrText xml:space="preserve"> PAGEREF _Toc242788778 \h </w:instrText>
+          <w:instrText xml:space="preserve"> PAGEREF _Toc243759829 \h </w:instrText>
         </w:r>
         <w:r>
           <w:rPr>
@@ -1340,7 +1340,7 @@
           <w14:ligatures w14:val="standardContextual"/>
         </w:rPr>
       </w:pPr>
-      <w:hyperlink w:anchor="_Toc242788779" w:history="1">
+      <w:hyperlink w:anchor="_Toc243759830" w:history="1">
         <w:r>
           <w:rPr>
             <w:rStyle w:val="Hyperlink"/>
@@ -1367,7 +1367,7 @@
             <w:noProof/>
             <w:webHidden/>
           </w:rPr>
-          <w:instrText xml:space="preserve"> PAGEREF _Toc242788779 \h </w:instrText>
+          <w:instrText xml:space="preserve"> PAGEREF _Toc243759830 \h </w:instrText>
         </w:r>
         <w:r>
           <w:rPr>
@@ -1413,7 +1413,7 @@
           <w14:ligatures w14:val="standardContextual"/>
         </w:rPr>
       </w:pPr>
-      <w:hyperlink w:anchor="_Toc242788780" w:history="1">
+      <w:hyperlink w:anchor="_Toc243759831" w:history="1">
         <w:r>
           <w:rPr>
             <w:rStyle w:val="Hyperlink"/>
@@ -1440,7 +1440,7 @@
             <w:noProof/>
             <w:webHidden/>
           </w:rPr>
-          <w:instrText xml:space="preserve"> PAGEREF _Toc242788780 \h </w:instrText>
+          <w:instrText xml:space="preserve"> PAGEREF _Toc243759831 \h </w:instrText>
         </w:r>
         <w:r>
           <w:rPr>
@@ -1486,7 +1486,7 @@
           <w14:ligatures w14:val="standardContextual"/>
         </w:rPr>
       </w:pPr>
-      <w:hyperlink w:anchor="_Toc242788781" w:history="1">
+      <w:hyperlink w:anchor="_Toc243759832" w:history="1">
         <w:r>
           <w:rPr>
             <w:rStyle w:val="Hyperlink"/>
@@ -1513,7 +1513,7 @@
             <w:noProof/>
             <w:webHidden/>
           </w:rPr>
-          <w:instrText xml:space="preserve"> PAGEREF _Toc242788781 \h </w:instrText>
+          <w:instrText xml:space="preserve"> PAGEREF _Toc243759832 \h </w:instrText>
         </w:r>
         <w:r>
           <w:rPr>
@@ -1559,7 +1559,7 @@
           <w14:ligatures w14:val="standardContextual"/>
         </w:rPr>
       </w:pPr>
-      <w:hyperlink w:anchor="_Toc242788782" w:history="1">
+      <w:hyperlink w:anchor="_Toc243759833" w:history="1">
         <w:r>
           <w:rPr>
             <w:rStyle w:val="Hyperlink"/>
@@ -1586,7 +1586,7 @@
             <w:noProof/>
             <w:webHidden/>
           </w:rPr>
-          <w:instrText xml:space="preserve"> PAGEREF _Toc242788782 \h </w:instrText>
+          <w:instrText xml:space="preserve"> PAGEREF _Toc243759833 \h </w:instrText>
         </w:r>
         <w:r>
           <w:rPr>
@@ -1632,7 +1632,7 @@
           <w14:ligatures w14:val="standardContextual"/>
         </w:rPr>
       </w:pPr>
-      <w:hyperlink w:anchor="_Toc242788783" w:history="1">
+      <w:hyperlink w:anchor="_Toc243759834" w:history="1">
         <w:r>
           <w:rPr>
             <w:rStyle w:val="Hyperlink"/>
@@ -1659,7 +1659,7 @@
             <w:noProof/>
             <w:webHidden/>
           </w:rPr>
-          <w:instrText xml:space="preserve"> PAGEREF _Toc242788783 \h </w:instrText>
+          <w:instrText xml:space="preserve"> PAGEREF _Toc243759834 \h </w:instrText>
         </w:r>
         <w:r>
           <w:rPr>
@@ -1705,7 +1705,7 @@
           <w14:ligatures w14:val="standardContextual"/>
         </w:rPr>
       </w:pPr>
-      <w:hyperlink w:anchor="_Toc242788784" w:history="1">
+      <w:hyperlink w:anchor="_Toc243759835" w:history="1">
         <w:r>
           <w:rPr>
             <w:rStyle w:val="Hyperlink"/>
@@ -1732,7 +1732,7 @@
             <w:noProof/>
             <w:webHidden/>
           </w:rPr>
-          <w:instrText xml:space="preserve"> PAGEREF _Toc242788784 \h </w:instrText>
+          <w:instrText xml:space="preserve"> PAGEREF _Toc243759835 \h </w:instrText>
         </w:r>
         <w:r>
           <w:rPr>
@@ -1778,7 +1778,7 @@
           <w14:ligatures w14:val="standardContextual"/>
         </w:rPr>
       </w:pPr>
-      <w:hyperlink w:anchor="_Toc242788785" w:history="1">
+      <w:hyperlink w:anchor="_Toc243759836" w:history="1">
         <w:r>
           <w:rPr>
             <w:rStyle w:val="Hyperlink"/>
@@ -1805,7 +1805,7 @@
             <w:noProof/>
             <w:webHidden/>
           </w:rPr>
-          <w:instrText xml:space="preserve"> PAGEREF _Toc242788785 \h </w:instrText>
+          <w:instrText xml:space="preserve"> PAGEREF _Toc243759836 \h </w:instrText>
         </w:r>
         <w:r>
           <w:rPr>
@@ -1851,7 +1851,7 @@
           <w14:ligatures w14:val="standardContextual"/>
         </w:rPr>
       </w:pPr>
-      <w:hyperlink w:anchor="_Toc242788786" w:history="1">
+      <w:hyperlink w:anchor="_Toc243759837" w:history="1">
         <w:r>
           <w:rPr>
             <w:rStyle w:val="Hyperlink"/>
@@ -1878,7 +1878,7 @@
             <w:noProof/>
             <w:webHidden/>
           </w:rPr>
-          <w:instrText xml:space="preserve"> PAGEREF _Toc242788786 \h </w:instrText>
+          <w:instrText xml:space="preserve"> PAGEREF _Toc243759837 \h </w:instrText>
         </w:r>
         <w:r>
           <w:rPr>
@@ -1924,7 +1924,7 @@
           <w14:ligatures w14:val="standardContextual"/>
         </w:rPr>
       </w:pPr>
-      <w:hyperlink w:anchor="_Toc242788787" w:history="1">
+      <w:hyperlink w:anchor="_Toc243759838" w:history="1">
         <w:r>
           <w:rPr>
             <w:rStyle w:val="Hyperlink"/>
@@ -1951,7 +1951,7 @@
             <w:noProof/>
             <w:webHidden/>
           </w:rPr>
-          <w:instrText xml:space="preserve"> PAGEREF _Toc242788787 \h </w:instrText>
+          <w:instrText xml:space="preserve"> PAGEREF _Toc243759838 \h </w:instrText>
         </w:r>
         <w:r>
           <w:rPr>
@@ -1997,7 +1997,7 @@
           <w14:ligatures w14:val="standardContextual"/>
         </w:rPr>
       </w:pPr>
-      <w:hyperlink w:anchor="_Toc242788788" w:history="1">
+      <w:hyperlink w:anchor="_Toc243759839" w:history="1">
         <w:r>
           <w:rPr>
             <w:rStyle w:val="Hyperlink"/>
@@ -2024,7 +2024,7 @@
             <w:noProof/>
             <w:webHidden/>
           </w:rPr>
-          <w:instrText xml:space="preserve"> PAGEREF _Toc242788788 \h </w:instrText>
+          <w:instrText xml:space="preserve"> PAGEREF _Toc243759839 \h </w:instrText>
         </w:r>
         <w:r>
           <w:rPr>
@@ -2070,7 +2070,7 @@
           <w14:ligatures w14:val="standardContextual"/>
         </w:rPr>
       </w:pPr>
-      <w:hyperlink w:anchor="_Toc242788789" w:history="1">
+      <w:hyperlink w:anchor="_Toc243759840" w:history="1">
         <w:r>
           <w:rPr>
             <w:rStyle w:val="Hyperlink"/>
@@ -2097,7 +2097,7 @@
             <w:noProof/>
             <w:webHidden/>
           </w:rPr>
-          <w:instrText xml:space="preserve"> PAGEREF _Toc242788789 \h </w:instrText>
+          <w:instrText xml:space="preserve"> PAGEREF _Toc243759840 \h </w:instrText>
         </w:r>
         <w:r>
           <w:rPr>
@@ -2143,7 +2143,7 @@
           <w14:ligatures w14:val="standardContextual"/>
         </w:rPr>
       </w:pPr>
-      <w:hyperlink w:anchor="_Toc242788790" w:history="1">
+      <w:hyperlink w:anchor="_Toc243759841" w:history="1">
         <w:r>
           <w:rPr>
             <w:rStyle w:val="Hyperlink"/>
@@ -2170,7 +2170,7 @@
             <w:noProof/>
             <w:webHidden/>
           </w:rPr>
-          <w:instrText xml:space="preserve"> PAGEREF _Toc242788790 \h </w:instrText>
+          <w:instrText xml:space="preserve"> PAGEREF _Toc243759841 \h </w:instrText>
         </w:r>
         <w:r>
           <w:rPr>
@@ -2216,7 +2216,7 @@
           <w14:ligatures w14:val="standardContextual"/>
         </w:rPr>
       </w:pPr>
-      <w:hyperlink w:anchor="_Toc242788791" w:history="1">
+      <w:hyperlink w:anchor="_Toc243759842" w:history="1">
         <w:r>
           <w:rPr>
             <w:rStyle w:val="Hyperlink"/>
@@ -2243,7 +2243,7 @@
             <w:noProof/>
             <w:webHidden/>
           </w:rPr>
-          <w:instrText xml:space="preserve"> PAGEREF _Toc242788791 \h </w:instrText>
+          <w:instrText xml:space="preserve"> PAGEREF _Toc243759842 \h </w:instrText>
         </w:r>
         <w:r>
           <w:rPr>
@@ -2288,7 +2288,7 @@
       <w:pPr>
         <w:pStyle w:val="Heading1"/>
       </w:pPr>
-      <w:bookmarkStart w:id="0" w:name="_Toc242788763"/>
+      <w:bookmarkStart w:id="0" w:name="_Toc243759814"/>
       <w:r>
         <w:t>Abstract</w:t>
       </w:r>
@@ -2324,7 +2324,7 @@
       <w:pPr>
         <w:pStyle w:val="Heading1"/>
       </w:pPr>
-      <w:bookmarkStart w:id="1" w:name="_Toc242788764"/>
+      <w:bookmarkStart w:id="1" w:name="_Toc243759815"/>
       <w:r>
         <w:t>1. Introduction and Background</w:t>
       </w:r>
@@ -2356,7 +2356,7 @@
       <w:pPr>
         <w:pStyle w:val="Heading1"/>
       </w:pPr>
-      <w:bookmarkStart w:id="2" w:name="_Toc242788765"/>
+      <w:bookmarkStart w:id="2" w:name="_Toc243759816"/>
       <w:r>
         <w:t>2. Problem Statement</w:t>
       </w:r>
@@ -2374,7 +2374,7 @@
       <w:pPr>
         <w:pStyle w:val="Heading1"/>
       </w:pPr>
-      <w:bookmarkStart w:id="3" w:name="_Toc242788766"/>
+      <w:bookmarkStart w:id="3" w:name="_Toc243759817"/>
       <w:r>
         <w:t>3. Research Question and Objectives</w:t>
       </w:r>
@@ -2459,7 +2459,7 @@
       <w:pPr>
         <w:pStyle w:val="Heading1"/>
       </w:pPr>
-      <w:bookmarkStart w:id="4" w:name="_Toc242788767"/>
+      <w:bookmarkStart w:id="4" w:name="_Toc243759818"/>
       <w:r>
         <w:t>4. Project Scope and Contributions</w:t>
       </w:r>
@@ -2565,7 +2565,7 @@
       <w:pPr>
         <w:pStyle w:val="Heading1"/>
       </w:pPr>
-      <w:bookmarkStart w:id="5" w:name="_Toc242788768"/>
+      <w:bookmarkStart w:id="5" w:name="_Toc243759819"/>
       <w:r>
         <w:t>5. Dataset Descriptions and Data Dictionary Summary</w:t>
       </w:r>
@@ -3218,7 +3218,7 @@
           <w:noProof/>
         </w:rPr>
         <w:drawing>
-          <wp:inline distT="0" distB="0" distL="0" distR="0" wp14:anchorId="5BBB1909" wp14:editId="33BC517A">
+          <wp:inline distT="0" distB="0" distL="0" distR="0" wp14:anchorId="769C1B23" wp14:editId="5DCA000E">
             <wp:extent cx="5760720" cy="2510864"/>
             <wp:effectExtent l="0" t="0" r="0" b="0"/>
             <wp:docPr id="1" name="Picture 1"/>
@@ -3270,7 +3270,7 @@
       <w:pPr>
         <w:pStyle w:val="Heading2"/>
       </w:pPr>
-      <w:bookmarkStart w:id="6" w:name="_Toc242788769"/>
+      <w:bookmarkStart w:id="6" w:name="_Toc243759820"/>
       <w:r>
         <w:t>5.1 Key fields</w:t>
       </w:r>
@@ -3957,7 +3957,7 @@
       <w:pPr>
         <w:pStyle w:val="Heading1"/>
       </w:pPr>
-      <w:bookmarkStart w:id="7" w:name="_Toc242788770"/>
+      <w:bookmarkStart w:id="7" w:name="_Toc243759821"/>
       <w:r>
         <w:t>6. Exploratory Data Analysis</w:t>
       </w:r>
@@ -3967,7 +3967,7 @@
       <w:pPr>
         <w:pStyle w:val="Heading2"/>
       </w:pPr>
-      <w:bookmarkStart w:id="8" w:name="_Toc242788771"/>
+      <w:bookmarkStart w:id="8" w:name="_Toc243759822"/>
       <w:r>
         <w:t>6.1 Data quality findings</w:t>
       </w:r>
@@ -4047,7 +4047,7 @@
       <w:pPr>
         <w:pStyle w:val="Heading2"/>
       </w:pPr>
-      <w:bookmarkStart w:id="9" w:name="_Toc242788772"/>
+      <w:bookmarkStart w:id="9" w:name="_Toc243759823"/>
       <w:r>
         <w:t>6.2 Distributions and trends</w:t>
       </w:r>
@@ -4071,7 +4071,7 @@
           <w:noProof/>
         </w:rPr>
         <w:drawing>
-          <wp:inline distT="0" distB="0" distL="0" distR="0" wp14:anchorId="5A8E7BAD" wp14:editId="272B8B31">
+          <wp:inline distT="0" distB="0" distL="0" distR="0" wp14:anchorId="2970FA1F" wp14:editId="6E38335A">
             <wp:extent cx="5760720" cy="2820069"/>
             <wp:effectExtent l="0" t="0" r="0" b="0"/>
             <wp:docPr id="2" name="Picture 2"/>
@@ -4137,7 +4137,7 @@
           <w:noProof/>
         </w:rPr>
         <w:drawing>
-          <wp:inline distT="0" distB="0" distL="0" distR="0" wp14:anchorId="4C87AD7E" wp14:editId="0C179AAF">
+          <wp:inline distT="0" distB="0" distL="0" distR="0" wp14:anchorId="7D16F775" wp14:editId="752035C4">
             <wp:extent cx="5760720" cy="2855138"/>
             <wp:effectExtent l="0" t="0" r="0" b="0"/>
             <wp:docPr id="3" name="Picture 3"/>
@@ -4189,7 +4189,7 @@
       <w:pPr>
         <w:pStyle w:val="Heading1"/>
       </w:pPr>
-      <w:bookmarkStart w:id="10" w:name="_Toc242788773"/>
+      <w:bookmarkStart w:id="10" w:name="_Toc243759824"/>
       <w:r>
         <w:t>7. Data Cleaning and Preprocessing Methodology</w:t>
       </w:r>
@@ -4213,7 +4213,7 @@
           <w:noProof/>
         </w:rPr>
         <w:drawing>
-          <wp:inline distT="0" distB="0" distL="0" distR="0" wp14:anchorId="0095F23C" wp14:editId="137AA64A">
+          <wp:inline distT="0" distB="0" distL="0" distR="0" wp14:anchorId="6FBBA08D" wp14:editId="0C0B4746">
             <wp:extent cx="5760720" cy="2725347"/>
             <wp:effectExtent l="0" t="0" r="0" b="0"/>
             <wp:docPr id="4" name="Picture 4"/>
@@ -5792,7 +5792,7 @@
       <w:pPr>
         <w:pStyle w:val="Heading1"/>
       </w:pPr>
-      <w:bookmarkStart w:id="11" w:name="_Toc242788774"/>
+      <w:bookmarkStart w:id="11" w:name="_Toc243759825"/>
       <w:r>
         <w:t>8. Feature Engineering and Temporal Alignment</w:t>
       </w:r>
@@ -6427,7 +6427,7 @@
       <w:pPr>
         <w:pStyle w:val="Heading1"/>
       </w:pPr>
-      <w:bookmarkStart w:id="12" w:name="_Toc242788775"/>
+      <w:bookmarkStart w:id="12" w:name="_Toc243759826"/>
       <w:r>
         <w:t>9. Machine Learning Algorithms and Baselines</w:t>
       </w:r>
@@ -6501,7 +6501,7 @@
       <w:pPr>
         <w:pStyle w:val="Heading1"/>
       </w:pPr>
-      <w:bookmarkStart w:id="13" w:name="_Toc242788776"/>
+      <w:bookmarkStart w:id="13" w:name="_Toc243759827"/>
       <w:r>
         <w:t>10. Training and Evaluation Methodology</w:t>
       </w:r>
@@ -6517,7 +6517,7 @@
           <w:noProof/>
         </w:rPr>
         <w:drawing>
-          <wp:inline distT="0" distB="0" distL="0" distR="0" wp14:anchorId="634A2B17" wp14:editId="2F63FE44">
+          <wp:inline distT="0" distB="0" distL="0" distR="0" wp14:anchorId="27B9FA42" wp14:editId="24C287CD">
             <wp:extent cx="5760720" cy="2725347"/>
             <wp:effectExtent l="0" t="0" r="0" b="0"/>
             <wp:docPr id="5" name="Picture 5"/>
@@ -7038,7 +7038,7 @@
       <w:pPr>
         <w:pStyle w:val="Heading1"/>
       </w:pPr>
-      <w:bookmarkStart w:id="14" w:name="_Toc242788777"/>
+      <w:bookmarkStart w:id="14" w:name="_Toc243759828"/>
       <w:r>
         <w:t>11. Comparative Model Performance</w:t>
       </w:r>
@@ -8692,7 +8692,7 @@
           <w:noProof/>
         </w:rPr>
         <w:drawing>
-          <wp:inline distT="0" distB="0" distL="0" distR="0" wp14:anchorId="2A1E3DE3" wp14:editId="6538F65E">
+          <wp:inline distT="0" distB="0" distL="0" distR="0" wp14:anchorId="55E0846F" wp14:editId="214582AC">
             <wp:extent cx="5760720" cy="3032358"/>
             <wp:effectExtent l="0" t="0" r="0" b="0"/>
             <wp:docPr id="6" name="Picture 6"/>
@@ -9213,7 +9213,7 @@
           <w:noProof/>
         </w:rPr>
         <w:drawing>
-          <wp:inline distT="0" distB="0" distL="0" distR="0" wp14:anchorId="55506A3C" wp14:editId="090863D4">
+          <wp:inline distT="0" distB="0" distL="0" distR="0" wp14:anchorId="02B2CCFD" wp14:editId="206ECAD9">
             <wp:extent cx="5760720" cy="1702031"/>
             <wp:effectExtent l="0" t="0" r="0" b="0"/>
             <wp:docPr id="7" name="Picture 7"/>
@@ -9265,7 +9265,7 @@
       <w:pPr>
         <w:pStyle w:val="Heading1"/>
       </w:pPr>
-      <w:bookmarkStart w:id="15" w:name="_Toc242788778"/>
+      <w:bookmarkStart w:id="15" w:name="_Toc243759829"/>
       <w:r>
         <w:t>12. Results and Discussion</w:t>
       </w:r>
@@ -9363,7 +9363,7 @@
           <w:noProof/>
         </w:rPr>
         <w:drawing>
-          <wp:inline distT="0" distB="0" distL="0" distR="0" wp14:anchorId="21EA824D" wp14:editId="3C9585FC">
+          <wp:inline distT="0" distB="0" distL="0" distR="0" wp14:anchorId="55689E81" wp14:editId="2995AA22">
             <wp:extent cx="5760720" cy="2221433"/>
             <wp:effectExtent l="0" t="0" r="0" b="0"/>
             <wp:docPr id="8" name="Picture 8"/>
@@ -9415,7 +9415,7 @@
       <w:pPr>
         <w:pStyle w:val="Heading1"/>
       </w:pPr>
-      <w:bookmarkStart w:id="16" w:name="_Toc242788779"/>
+      <w:bookmarkStart w:id="16" w:name="_Toc243759830"/>
       <w:r>
         <w:t>13. Explainability and Important Features</w:t>
       </w:r>
@@ -9442,7 +9442,7 @@
           <w:noProof/>
         </w:rPr>
         <w:drawing>
-          <wp:inline distT="0" distB="0" distL="0" distR="0" wp14:anchorId="4F41EF5C" wp14:editId="2F887BF5">
+          <wp:inline distT="0" distB="0" distL="0" distR="0" wp14:anchorId="6DACAA13" wp14:editId="14057EEF">
             <wp:extent cx="5760720" cy="1558880"/>
             <wp:effectExtent l="0" t="0" r="0" b="0"/>
             <wp:docPr id="9" name="Picture 9"/>
@@ -9508,7 +9508,7 @@
           <w:noProof/>
         </w:rPr>
         <w:drawing>
-          <wp:inline distT="0" distB="0" distL="0" distR="0" wp14:anchorId="2208302F" wp14:editId="2F2D4E2C">
+          <wp:inline distT="0" distB="0" distL="0" distR="0" wp14:anchorId="31E35D2F" wp14:editId="7A7A9D0D">
             <wp:extent cx="5760720" cy="3553747"/>
             <wp:effectExtent l="0" t="0" r="0" b="0"/>
             <wp:docPr id="10" name="Picture 10"/>
@@ -9574,7 +9574,7 @@
           <w:noProof/>
         </w:rPr>
         <w:drawing>
-          <wp:inline distT="0" distB="0" distL="0" distR="0" wp14:anchorId="781CB251" wp14:editId="7FF1C070">
+          <wp:inline distT="0" distB="0" distL="0" distR="0" wp14:anchorId="4CE7F8C7" wp14:editId="7A3FCA46">
             <wp:extent cx="5760720" cy="2002890"/>
             <wp:effectExtent l="0" t="0" r="0" b="0"/>
             <wp:docPr id="11" name="Picture 11"/>
@@ -9626,7 +9626,7 @@
       <w:pPr>
         <w:pStyle w:val="Heading1"/>
       </w:pPr>
-      <w:bookmarkStart w:id="17" w:name="_Toc242788780"/>
+      <w:bookmarkStart w:id="17" w:name="_Toc243759831"/>
       <w:r>
         <w:t>14. CABG Hospital-Level Prediction Analysis</w:t>
       </w:r>
@@ -9653,7 +9653,7 @@
           <w:noProof/>
         </w:rPr>
         <w:drawing>
-          <wp:inline distT="0" distB="0" distL="0" distR="0" wp14:anchorId="787081FE" wp14:editId="0F37F07A">
+          <wp:inline distT="0" distB="0" distL="0" distR="0" wp14:anchorId="7C3FD36A" wp14:editId="379E909B">
             <wp:extent cx="5760720" cy="3613493"/>
             <wp:effectExtent l="0" t="0" r="0" b="0"/>
             <wp:docPr id="12" name="Picture 12"/>
@@ -9724,7 +9724,7 @@
       <w:pPr>
         <w:pStyle w:val="Heading1"/>
       </w:pPr>
-      <w:bookmarkStart w:id="18" w:name="_Toc242788781"/>
+      <w:bookmarkStart w:id="18" w:name="_Toc243759832"/>
       <w:r>
         <w:t>15. Stroke Outcome Analysis</w:t>
       </w:r>
@@ -9748,7 +9748,7 @@
           <w:noProof/>
         </w:rPr>
         <w:drawing>
-          <wp:inline distT="0" distB="0" distL="0" distR="0" wp14:anchorId="70112DE4" wp14:editId="5E1A7F29">
+          <wp:inline distT="0" distB="0" distL="0" distR="0" wp14:anchorId="591E50F7" wp14:editId="7B14F895">
             <wp:extent cx="5760720" cy="2116858"/>
             <wp:effectExtent l="0" t="0" r="0" b="0"/>
             <wp:docPr id="13" name="Picture 13"/>
@@ -10529,7 +10529,7 @@
           <w:noProof/>
         </w:rPr>
         <w:drawing>
-          <wp:inline distT="0" distB="0" distL="0" distR="0" wp14:anchorId="398D2123" wp14:editId="763CFC00">
+          <wp:inline distT="0" distB="0" distL="0" distR="0" wp14:anchorId="6E9158B3" wp14:editId="5904AC82">
             <wp:extent cx="5760720" cy="2983163"/>
             <wp:effectExtent l="0" t="0" r="0" b="0"/>
             <wp:docPr id="14" name="Picture 14"/>
@@ -10589,7 +10589,7 @@
       <w:pPr>
         <w:pStyle w:val="Heading1"/>
       </w:pPr>
-      <w:bookmarkStart w:id="19" w:name="_Toc242788782"/>
+      <w:bookmarkStart w:id="19" w:name="_Toc243759833"/>
       <w:r>
         <w:t>16. County and Population-Level Trends</w:t>
       </w:r>
@@ -10613,7 +10613,7 @@
           <w:noProof/>
         </w:rPr>
         <w:drawing>
-          <wp:inline distT="0" distB="0" distL="0" distR="0" wp14:anchorId="1C9C865C" wp14:editId="3BDB42BA">
+          <wp:inline distT="0" distB="0" distL="0" distR="0" wp14:anchorId="235ADD35" wp14:editId="6FE4F5E5">
             <wp:extent cx="5760720" cy="2616524"/>
             <wp:effectExtent l="0" t="0" r="0" b="0"/>
             <wp:docPr id="15" name="Picture 15"/>
@@ -10679,7 +10679,7 @@
           <w:noProof/>
         </w:rPr>
         <w:drawing>
-          <wp:inline distT="0" distB="0" distL="0" distR="0" wp14:anchorId="659BA219" wp14:editId="1EA692B1">
+          <wp:inline distT="0" distB="0" distL="0" distR="0" wp14:anchorId="3DBA4282" wp14:editId="2D9659DB">
             <wp:extent cx="3840480" cy="3932969"/>
             <wp:effectExtent l="0" t="0" r="0" b="0"/>
             <wp:docPr id="16" name="Picture 16"/>
@@ -10737,7 +10737,7 @@
           <w:noProof/>
         </w:rPr>
         <w:drawing>
-          <wp:inline distT="0" distB="0" distL="0" distR="0" wp14:anchorId="77566292" wp14:editId="481065D0">
+          <wp:inline distT="0" distB="0" distL="0" distR="0" wp14:anchorId="7C01FE39" wp14:editId="7382BE79">
             <wp:extent cx="4206240" cy="3887839"/>
             <wp:effectExtent l="0" t="0" r="0" b="0"/>
             <wp:docPr id="17" name="Picture 17"/>
@@ -10803,7 +10803,7 @@
           <w:noProof/>
         </w:rPr>
         <w:drawing>
-          <wp:inline distT="0" distB="0" distL="0" distR="0" wp14:anchorId="381EB042" wp14:editId="0C5CA9B3">
+          <wp:inline distT="0" distB="0" distL="0" distR="0" wp14:anchorId="79D22C34" wp14:editId="0EF6B7A9">
             <wp:extent cx="5760720" cy="3556142"/>
             <wp:effectExtent l="0" t="0" r="0" b="0"/>
             <wp:docPr id="18" name="Picture 18"/>
@@ -10855,7 +10855,7 @@
       <w:pPr>
         <w:pStyle w:val="Heading1"/>
       </w:pPr>
-      <w:bookmarkStart w:id="20" w:name="_Toc242788783"/>
+      <w:bookmarkStart w:id="20" w:name="_Toc243759834"/>
       <w:r>
         <w:t>17. Dashboard Design and Functionality</w:t>
       </w:r>
@@ -11133,7 +11133,7 @@
           <w:noProof/>
         </w:rPr>
         <w:drawing>
-          <wp:inline distT="0" distB="0" distL="0" distR="0" wp14:anchorId="59E6E3B6" wp14:editId="09BA92FD">
+          <wp:inline distT="0" distB="0" distL="0" distR="0" wp14:anchorId="29F0901C" wp14:editId="0CD5411D">
             <wp:extent cx="5760720" cy="3840480"/>
             <wp:effectExtent l="0" t="0" r="0" b="0"/>
             <wp:docPr id="19" name="Picture 19"/>
@@ -11191,7 +11191,7 @@
           <w:noProof/>
         </w:rPr>
         <w:drawing>
-          <wp:inline distT="0" distB="0" distL="0" distR="0" wp14:anchorId="55A5AD87" wp14:editId="4FFF0808">
+          <wp:inline distT="0" distB="0" distL="0" distR="0" wp14:anchorId="6C2FBF30" wp14:editId="7EC6837A">
             <wp:extent cx="5760720" cy="3840480"/>
             <wp:effectExtent l="0" t="0" r="0" b="0"/>
             <wp:docPr id="20" name="Picture 20"/>
@@ -11249,7 +11249,7 @@
           <w:noProof/>
         </w:rPr>
         <w:drawing>
-          <wp:inline distT="0" distB="0" distL="0" distR="0" wp14:anchorId="05E3FBA4" wp14:editId="1639892A">
+          <wp:inline distT="0" distB="0" distL="0" distR="0" wp14:anchorId="20AEE705" wp14:editId="70E15C7E">
             <wp:extent cx="5760720" cy="3840480"/>
             <wp:effectExtent l="0" t="0" r="0" b="0"/>
             <wp:docPr id="21" name="Picture 21"/>
@@ -11307,7 +11307,7 @@
           <w:noProof/>
         </w:rPr>
         <w:drawing>
-          <wp:inline distT="0" distB="0" distL="0" distR="0" wp14:anchorId="384FC7C8" wp14:editId="67B00DFC">
+          <wp:inline distT="0" distB="0" distL="0" distR="0" wp14:anchorId="10A63806" wp14:editId="53C00789">
             <wp:extent cx="5760720" cy="3840480"/>
             <wp:effectExtent l="0" t="0" r="0" b="0"/>
             <wp:docPr id="22" name="Picture 22"/>
@@ -11359,7 +11359,7 @@
       <w:pPr>
         <w:pStyle w:val="Heading1"/>
       </w:pPr>
-      <w:bookmarkStart w:id="21" w:name="_Toc242788784"/>
+      <w:bookmarkStart w:id="21" w:name="_Toc243759835"/>
       <w:r>
         <w:t>18. GitHub Actions and Streamlit Deployment Architecture</w:t>
       </w:r>
@@ -11375,7 +11375,7 @@
           <w:noProof/>
         </w:rPr>
         <w:drawing>
-          <wp:inline distT="0" distB="0" distL="0" distR="0" wp14:anchorId="68155D94" wp14:editId="16B3D939">
+          <wp:inline distT="0" distB="0" distL="0" distR="0" wp14:anchorId="08EDE5F2" wp14:editId="299B19DB">
             <wp:extent cx="5760720" cy="3504017"/>
             <wp:effectExtent l="0" t="0" r="0" b="0"/>
             <wp:docPr id="23" name="Picture 23"/>
@@ -11483,7 +11483,7 @@
       <w:pPr>
         <w:pStyle w:val="Heading1"/>
       </w:pPr>
-      <w:bookmarkStart w:id="22" w:name="_Toc242788785"/>
+      <w:bookmarkStart w:id="22" w:name="_Toc243759836"/>
       <w:r>
         <w:t>19. Synthetic Dataset Testing Methodology</w:t>
       </w:r>
@@ -11804,7 +11804,7 @@
           <w:noProof/>
         </w:rPr>
         <w:drawing>
-          <wp:inline distT="0" distB="0" distL="0" distR="0" wp14:anchorId="0CA12D1D" wp14:editId="1E4C5700">
+          <wp:inline distT="0" distB="0" distL="0" distR="0" wp14:anchorId="3E3BAF17" wp14:editId="12B8D89B">
             <wp:extent cx="3840480" cy="3241121"/>
             <wp:effectExtent l="0" t="0" r="0" b="0"/>
             <wp:docPr id="24" name="Picture 24"/>
@@ -11868,7 +11868,7 @@
       <w:pPr>
         <w:pStyle w:val="Heading1"/>
       </w:pPr>
-      <w:bookmarkStart w:id="23" w:name="_Toc242788786"/>
+      <w:bookmarkStart w:id="23" w:name="_Toc243759837"/>
       <w:r>
         <w:t>20. Limitations, Ethics and Responsible Interpretation</w:t>
       </w:r>
@@ -11990,7 +11990,7 @@
       <w:pPr>
         <w:pStyle w:val="Heading1"/>
       </w:pPr>
-      <w:bookmarkStart w:id="24" w:name="_Toc242788787"/>
+      <w:bookmarkStart w:id="24" w:name="_Toc243759838"/>
       <w:r>
         <w:t>21. Conclusion and Future Improvements</w:t>
       </w:r>
@@ -12019,7 +12019,7 @@
       <w:pPr>
         <w:pStyle w:val="Heading1"/>
       </w:pPr>
-      <w:bookmarkStart w:id="25" w:name="_Toc242788788"/>
+      <w:bookmarkStart w:id="25" w:name="_Toc243759839"/>
       <w:r>
         <w:t>References</w:t>
       </w:r>
@@ -12181,7 +12181,7 @@
       <w:pPr>
         <w:pStyle w:val="Heading1"/>
       </w:pPr>
-      <w:bookmarkStart w:id="26" w:name="_Toc242788789"/>
+      <w:bookmarkStart w:id="26" w:name="_Toc243759840"/>
       <w:r>
         <w:t>Appendix A. Reproducing the Project</w:t>
       </w:r>
@@ -12296,7 +12296,7 @@
       <w:pPr>
         <w:pStyle w:val="Heading1"/>
       </w:pPr>
-      <w:bookmarkStart w:id="27" w:name="_Toc242788790"/>
+      <w:bookmarkStart w:id="27" w:name="_Toc243759841"/>
       <w:r>
         <w:t>Appendix B. Run Configuration</w:t>
       </w:r>
@@ -12900,7 +12900,7 @@
       <w:pPr>
         <w:pStyle w:val="Heading1"/>
       </w:pPr>
-      <w:bookmarkStart w:id="28" w:name="_Toc242788791"/>
+      <w:bookmarkStart w:id="28" w:name="_Toc243759842"/>
       <w:r>
         <w:t>Appendix C. Validation Checks</w:t>
       </w:r>
@@ -15748,31 +15748,31 @@
       </w:rPr>
     </w:lvl>
   </w:abstractNum>
-  <w:num w:numId="1" w16cid:durableId="570507756">
+  <w:num w:numId="1" w16cid:durableId="1478842716">
     <w:abstractNumId w:val="8"/>
   </w:num>
-  <w:num w:numId="2" w16cid:durableId="213078606">
+  <w:num w:numId="2" w16cid:durableId="1233539297">
     <w:abstractNumId w:val="6"/>
   </w:num>
-  <w:num w:numId="3" w16cid:durableId="1789855941">
+  <w:num w:numId="3" w16cid:durableId="1427507146">
     <w:abstractNumId w:val="5"/>
   </w:num>
-  <w:num w:numId="4" w16cid:durableId="1180117269">
+  <w:num w:numId="4" w16cid:durableId="1906329009">
     <w:abstractNumId w:val="4"/>
   </w:num>
-  <w:num w:numId="5" w16cid:durableId="1136263408">
+  <w:num w:numId="5" w16cid:durableId="538201592">
     <w:abstractNumId w:val="7"/>
   </w:num>
-  <w:num w:numId="6" w16cid:durableId="391269020">
+  <w:num w:numId="6" w16cid:durableId="650209107">
     <w:abstractNumId w:val="3"/>
   </w:num>
-  <w:num w:numId="7" w16cid:durableId="1839079432">
+  <w:num w:numId="7" w16cid:durableId="1103766830">
     <w:abstractNumId w:val="2"/>
   </w:num>
-  <w:num w:numId="8" w16cid:durableId="1792816606">
+  <w:num w:numId="8" w16cid:durableId="595793237">
     <w:abstractNumId w:val="1"/>
   </w:num>
-  <w:num w:numId="9" w16cid:durableId="395518496">
+  <w:num w:numId="9" w16cid:durableId="1226260194">
     <w:abstractNumId w:val="0"/>
   </w:num>
 </w:numbering>
@@ -27173,7 +27173,7 @@
     <w:autoRedefine/>
     <w:uiPriority w:val="39"/>
     <w:unhideWhenUsed/>
-    <w:rsid w:val="00B60D86"/>
+    <w:rsid w:val="009E3BFA"/>
   </w:style>
   <w:style w:type="paragraph" w:styleId="TOC2">
     <w:name w:val="toc 2"/>
@@ -27182,7 +27182,7 @@
     <w:autoRedefine/>
     <w:uiPriority w:val="39"/>
     <w:unhideWhenUsed/>
-    <w:rsid w:val="00B60D86"/>
+    <w:rsid w:val="009E3BFA"/>
     <w:pPr>
       <w:ind w:left="210"/>
     </w:pPr>
@@ -27192,7 +27192,7 @@
     <w:basedOn w:val="DefaultParagraphFont"/>
     <w:uiPriority w:val="99"/>
     <w:unhideWhenUsed/>
-    <w:rsid w:val="00B60D86"/>
+    <w:rsid w:val="009E3BFA"/>
     <w:rPr>
       <w:color w:val="0000FF" w:themeColor="hyperlink"/>
       <w:u w:val="single"/>

</xml_diff>